<commit_message>
progress report 1 update
</commit_message>
<xml_diff>
--- a/docs/Zisyphuz_Progress_Report1.docx
+++ b/docs/Zisyphuz_Progress_Report1.docx
@@ -302,21 +302,7 @@
         <w:rPr>
           <w:szCs w:val="24"/>
         </w:rPr>
-        <w:t xml:space="preserve">Theseus is a weekly AI review system for goal-time alignment. The project direction has stayed stable since the proposal. The system helps users review whether their real weekly time </w:t>
-      </w:r>
-      <w:proofErr w:type="gramStart"/>
-      <w:r>
-        <w:rPr>
-          <w:szCs w:val="24"/>
-        </w:rPr>
-        <w:t>supported</w:t>
-      </w:r>
-      <w:proofErr w:type="gramEnd"/>
-      <w:r>
-        <w:rPr>
-          <w:szCs w:val="24"/>
-        </w:rPr>
-        <w:t xml:space="preserve"> their important goals. The focus is the completed week, not automatic scheduling.</w:t>
+        <w:t>Theseus is a weekly AI review system for goal-time alignment. The project direction has stayed stable since the proposal. The system helps users review whether their real weekly time supported their important goals. The focus is the completed week, not automatic scheduling.</w:t>
       </w:r>
     </w:p>
     <w:p>
@@ -864,21 +850,7 @@
         <w:rPr>
           <w:szCs w:val="24"/>
         </w:rPr>
-        <w:t>The current technical evidence is a local review-engine demo. The sample data can be loaded and passed through review_engine.</w:t>
-      </w:r>
-      <w:proofErr w:type="gramStart"/>
-      <w:r>
-        <w:rPr>
-          <w:szCs w:val="24"/>
-        </w:rPr>
-        <w:t>rules.analyze</w:t>
-      </w:r>
-      <w:proofErr w:type="gramEnd"/>
-      <w:r>
-        <w:rPr>
-          <w:szCs w:val="24"/>
-        </w:rPr>
-        <w:t xml:space="preserve">_week. The output contains wins, insights, risk flags, </w:t>
+        <w:t xml:space="preserve">The current technical evidence is a local review-engine demo. The sample data can be loaded and passed through review_engine.rules.analyze_week. The output contains wins, insights, risk flags, </w:t>
       </w:r>
       <w:r>
         <w:rPr>
@@ -895,15 +867,7 @@
         </w:rPr>
       </w:pPr>
       <w:r>
-        <w:t>The demo path is currently: sample_</w:t>
-      </w:r>
-      <w:proofErr w:type="gramStart"/>
-      <w:r>
-        <w:t>week.json</w:t>
-      </w:r>
-      <w:proofErr w:type="gramEnd"/>
-      <w:r>
-        <w:t xml:space="preserve"> -&gt; review_engine -&gt; structured weekly review. It does not yet prove database persistence or frontend integration. The team will not describe SQLite storage, full CRUD flows, or a connected frontend review page as completed work until they are implemented and verified.</w:t>
+        <w:t>The demo path is currently: sample_week.json -&gt; review_engine -&gt; structured weekly review. It does not yet prove database persistence or frontend integration. The team will not describe SQLite storage, full CRUD flows, or a connected frontend review page as completed work until they are implemented and verified.</w:t>
       </w:r>
     </w:p>
     <w:tbl>
@@ -1453,15 +1417,7 @@
         </w:rPr>
       </w:pPr>
       <w:r>
-        <w:t xml:space="preserve">Another challenge is </w:t>
-      </w:r>
-      <w:proofErr w:type="gramStart"/>
-      <w:r>
-        <w:t>review</w:t>
-      </w:r>
-      <w:proofErr w:type="gramEnd"/>
-      <w:r>
-        <w:t xml:space="preserve"> quality. Raw AI advice can become vague if it is not tied to clear evidence. The current design uses deterministic evidence checks first. AI wording or LLM polish can be added later, but it should explain the evidence instead of replacing it. The feedback tone also needs control, because a review that only lists missed tasks can feel blaming. For this reason, the report and demo keep the win -&gt; insight -&gt; next step structure.</w:t>
+        <w:t>Another challenge is review quality. Raw AI advice can become vague if it is not tied to clear evidence. The current design uses deterministic evidence checks first. AI wording or LLM polish can be added later, but it should explain the evidence instead of replacing it. The feedback tone also needs control, because a review that only lists missed tasks can feel blaming. For this reason, the report and demo keep the win -&gt; insight -&gt; next step structure.</w:t>
       </w:r>
     </w:p>
     <w:tbl>
@@ -1786,15 +1742,7 @@
         </w:rPr>
       </w:pPr>
       <w:r>
-        <w:t>Sprint 1 starts after Progress Report 1 and focuses on backend persistence. The target is to move from a sample-file path to a stored review path: sample_</w:t>
-      </w:r>
-      <w:proofErr w:type="gramStart"/>
-      <w:r>
-        <w:t>week.json</w:t>
-      </w:r>
-      <w:proofErr w:type="gramEnd"/>
-      <w:r>
-        <w:t xml:space="preserve"> -&gt; SQLite -&gt; review_engine -&gt; stored weekly_review.</w:t>
+        <w:t>Sprint 1 starts after Progress Report 1 and focuses on backend persistence. The target is to move from a sample-file path to a stored review path: sample_week.json -&gt; SQLite -&gt; review_engine -&gt; stored weekly_review.</w:t>
       </w:r>
     </w:p>
     <w:p>
@@ -1850,21 +1798,7 @@
         <w:rPr>
           <w:sz w:val="22"/>
         </w:rPr>
-        <w:t>Build a sample data loader that imports sample_</w:t>
-      </w:r>
-      <w:proofErr w:type="gramStart"/>
-      <w:r>
-        <w:rPr>
-          <w:sz w:val="22"/>
-        </w:rPr>
-        <w:t>week.json</w:t>
-      </w:r>
-      <w:proofErr w:type="gramEnd"/>
-      <w:r>
-        <w:rPr>
-          <w:sz w:val="22"/>
-        </w:rPr>
-        <w:t xml:space="preserve"> into SQLite.</w:t>
+        <w:t>Build a sample data loader that imports sample_week.json into SQLite.</w:t>
       </w:r>
     </w:p>
     <w:p>
@@ -2446,7 +2380,6 @@
         <w:t>. (</w:t>
       </w:r>
       <w:proofErr w:type="spellStart"/>
-      <w:proofErr w:type="gramStart"/>
       <w:r>
         <w:rPr>
           <w:sz w:val="21"/>
@@ -2460,15 +2393,7 @@
           <w:sz w:val="21"/>
           <w:lang w:val="fr-FR"/>
         </w:rPr>
-        <w:t>.</w:t>
-      </w:r>
-      <w:proofErr w:type="gramEnd"/>
-      <w:r>
-        <w:rPr>
-          <w:sz w:val="21"/>
-          <w:lang w:val="fr-FR"/>
-        </w:rPr>
-        <w:t xml:space="preserve">). </w:t>
+        <w:t xml:space="preserve">.). </w:t>
       </w:r>
       <w:proofErr w:type="spellStart"/>
       <w:r>
@@ -2518,7 +2443,6 @@
         <w:t>SQLite. (</w:t>
       </w:r>
       <w:proofErr w:type="spellStart"/>
-      <w:proofErr w:type="gramStart"/>
       <w:r>
         <w:rPr>
           <w:sz w:val="21"/>
@@ -2532,15 +2456,7 @@
           <w:sz w:val="21"/>
           <w:lang w:val="fr-FR"/>
         </w:rPr>
-        <w:t>.</w:t>
-      </w:r>
-      <w:proofErr w:type="gramEnd"/>
-      <w:r>
-        <w:rPr>
-          <w:sz w:val="21"/>
-          <w:lang w:val="fr-FR"/>
-        </w:rPr>
-        <w:t xml:space="preserve">). SQLite documentation. </w:t>
+        <w:t xml:space="preserve">.). SQLite documentation. </w:t>
       </w:r>
       <w:r>
         <w:rPr>
@@ -2563,23 +2479,7 @@
           <w:lang w:val="fr-FR"/>
         </w:rPr>
         <w:lastRenderedPageBreak/>
-        <w:t xml:space="preserve">Appendix </w:t>
-      </w:r>
-      <w:proofErr w:type="gramStart"/>
-      <w:r>
-        <w:rPr>
-          <w:rFonts w:ascii="Aptos Display" w:eastAsia="Aptos Display" w:hAnsi="Aptos Display" w:cs="Aptos Display"/>
-          <w:lang w:val="fr-FR"/>
-        </w:rPr>
-        <w:t>A:</w:t>
-      </w:r>
-      <w:proofErr w:type="gramEnd"/>
-      <w:r>
-        <w:rPr>
-          <w:rFonts w:ascii="Aptos Display" w:eastAsia="Aptos Display" w:hAnsi="Aptos Display" w:cs="Aptos Display"/>
-          <w:lang w:val="fr-FR"/>
-        </w:rPr>
-        <w:t xml:space="preserve"> AI Usage Report and Documentation</w:t>
+        <w:t>Appendix A: AI Usage Report and Documentation</w:t>
       </w:r>
     </w:p>
     <w:p>
@@ -2721,7 +2621,7 @@
               <w:rPr>
                 <w:sz w:val="21"/>
               </w:rPr>
-              <w:t>Gemini 3.5 Flash / Pro</w:t>
+              <w:t>Gemini Flash / Pro variants via Google Gemini</w:t>
             </w:r>
           </w:p>
         </w:tc>
@@ -2795,80 +2695,6 @@
               <w:rPr>
                 <w:sz w:val="21"/>
               </w:rPr>
-              <w:t>Claude 3.5 Sonnet</w:t>
-            </w:r>
-          </w:p>
-        </w:tc>
-        <w:tc>
-          <w:tcPr>
-            <w:tcW w:w="4320" w:type="dxa"/>
-            <w:tcMar>
-              <w:top w:w="80" w:type="dxa"/>
-              <w:left w:w="90" w:type="dxa"/>
-              <w:bottom w:w="80" w:type="dxa"/>
-              <w:right w:w="90" w:type="dxa"/>
-            </w:tcMar>
-            <w:vAlign w:val="center"/>
-          </w:tcPr>
-          <w:p>
-            <w:pPr>
-              <w:spacing w:after="40" w:line="240" w:lineRule="auto"/>
-            </w:pPr>
-            <w:r>
-              <w:rPr>
-                <w:sz w:val="21"/>
-              </w:rPr>
-              <w:t>Code architecture skeleton discussion, rules-engine logic review, and Python script support for sample review execution.</w:t>
-            </w:r>
-          </w:p>
-        </w:tc>
-        <w:tc>
-          <w:tcPr>
-            <w:tcW w:w="3096" w:type="dxa"/>
-            <w:tcMar>
-              <w:top w:w="80" w:type="dxa"/>
-              <w:left w:w="90" w:type="dxa"/>
-              <w:bottom w:w="80" w:type="dxa"/>
-              <w:right w:w="90" w:type="dxa"/>
-            </w:tcMar>
-            <w:vAlign w:val="center"/>
-          </w:tcPr>
-          <w:p>
-            <w:pPr>
-              <w:spacing w:after="40" w:line="240" w:lineRule="auto"/>
-            </w:pPr>
-            <w:r>
-              <w:rPr>
-                <w:sz w:val="21"/>
-              </w:rPr>
-              <w:t>The team tested and revised code-related outputs before treating them as project evidence.</w:t>
-            </w:r>
-          </w:p>
-        </w:tc>
-      </w:tr>
-      <w:tr>
-        <w:trPr>
-          <w:jc w:val="center"/>
-        </w:trPr>
-        <w:tc>
-          <w:tcPr>
-            <w:tcW w:w="2160" w:type="dxa"/>
-            <w:tcMar>
-              <w:top w:w="80" w:type="dxa"/>
-              <w:left w:w="90" w:type="dxa"/>
-              <w:bottom w:w="80" w:type="dxa"/>
-              <w:right w:w="90" w:type="dxa"/>
-            </w:tcMar>
-            <w:vAlign w:val="center"/>
-          </w:tcPr>
-          <w:p>
-            <w:pPr>
-              <w:spacing w:after="40" w:line="240" w:lineRule="auto"/>
-            </w:pPr>
-            <w:r>
-              <w:rPr>
-                <w:sz w:val="21"/>
-              </w:rPr>
               <w:t>ChatGPT / document assistant</w:t>
             </w:r>
           </w:p>
@@ -2892,7 +2718,19 @@
               <w:rPr>
                 <w:sz w:val="21"/>
               </w:rPr>
-              <w:t>Progress report restructuring, template compliance review, IELTS 6.5-level wording, and style consistency with the earlier proposal.</w:t>
+              <w:t xml:space="preserve">Progress report restructuring, template compliance review, </w:t>
+            </w:r>
+            <w:r>
+              <w:rPr>
+                <w:sz w:val="21"/>
+              </w:rPr>
+              <w:t>plain, concise academic wording</w:t>
+            </w:r>
+            <w:r>
+              <w:rPr>
+                <w:sz w:val="21"/>
+              </w:rPr>
+              <w:t>, and style consistency with the earlier proposal.</w:t>
             </w:r>
           </w:p>
         </w:tc>
@@ -3354,22 +3192,7 @@
         <w:rPr>
           <w:sz w:val="21"/>
         </w:rPr>
-        <w:lastRenderedPageBreak/>
-        <w:t xml:space="preserve">The team reviewed the </w:t>
-      </w:r>
-      <w:proofErr w:type="gramStart"/>
-      <w:r>
-        <w:rPr>
-          <w:sz w:val="21"/>
-        </w:rPr>
-        <w:t>wording</w:t>
-      </w:r>
-      <w:proofErr w:type="gramEnd"/>
-      <w:r>
-        <w:rPr>
-          <w:sz w:val="21"/>
-        </w:rPr>
-        <w:t xml:space="preserve"> so SQLite persistence, CRUD APIs, and frontend pages are described as planned work, not completed work.</w:t>
+        <w:t>The team reviewed the wording so SQLite persistence, CRUD APIs, and frontend pages are described as planned work, not completed work.</w:t>
       </w:r>
     </w:p>
     <w:p>

</xml_diff>